<commit_message>
Drop the empty FIN6 IOC file and align every reported count with the artefacts
An empty fin6_ioc.csv is indistinguishable from a collected dataset, so the file
is removed and its absence is documented in the report and in the IOC builder.
The merged set now holds 35 rows (TA542 7, TA505 28) and all counts in the report
follow the files rather than the earlier draft.
</commit_message>
<xml_diff>
--- a/MATEL_Threat_Intelligence_Report.docx
+++ b/MATEL_Threat_Intelligence_Report.docx
@@ -668,7 +668,7 @@
           <w:sz w:val="24"/>
           <w:szCs w:val="24"/>
         </w:rPr>
-        <w:t>Laporan ini menyajikan analisis intelijen ancaman terhadap tiga kampanye malware: TA542 (Emotet), TA505 (Dridex), dan FIN6. Metode yang dipakai adalah intelijen ancaman pasif berbasis indikator: seluruh bukti berasal dari laporan yang telah dipublikasikan dan tidak ada sampel yang dijalankan. Tujuan kegiatan ini adalah mengumpulkan indikator kompromi, memetakan taktik dan teknik ke MITRE ATT&amp;CK, menganalisis infrastruktur command and control berdasarkan data pasif, menyusun model propagasi, dan membandingkan ketiga pelaku secara deskriptif. Kerangka kerja ini mengikuti siklus intelijen ancaman yang lazim digunakan dalam praktik CTI (Tolah, 2025; Abraham et al., 2025) dan memanfaatkan taksonomi ATT&amp;CK sebagai bahasa pemetaan bersama (Georgiadou et al., 2021). Temuan utama pertama, pengumpulan indikator menghasilkan 36 baris indikator ternormalisasi: 7 baris untuk TA542/Emotet dan 29 baris untuk TA505/Dridex, seluruhnya berasal dari publikasi resmi pemerintah dan telemetri sinkhole. Tidak satu pun indikator direkayasa; untuk FIN6 tidak terdapat indikator jaringan pada sumber yang dianalisis sehingga himpunannya dibiarkan kosong. Temuan kedua, pemetaan teknik menghasilkan 70 baris teknik terdokumentasi: 26 untuk TA542, 22 untuk TA505, dan 22 untuk FIN6, seluruhnya berkelas Documented dengan kalimat bukti yang dapat ditelusuri ke halaman MITRE ATT&amp;CK [MITRE-1][MITRE-2][MITRE-3][MITRE-4]. Temuan ketiga, ketiga pelaku berbeda secara struktural pada tahap command and control: TA542 memakai HTTP pada port non-standar dengan kanal terenkripsi, TA505 memakai botnet peer-to-peer dengan fast flux, dan FIN6 memakai terowongan SSH serta layanan web publik. Perbedaan ini penting karena strategi deteksi jaringan yang efektif untuk satu pelaku tidak otomatis berlaku untuk pelaku lain (Yamaguchi, 2022; Kim et al., 2022). Temuan keempat, kualitas bukti tidak seragam: seluruh baris teknik berkelas Documented, tetapi indikator jaringan hanya tersedia untuk dua dari tiga pelaku, dan laporan ini secara eksplisit menolak mengisi kekosongan tersebut. Temuan kelima, verifikasi referensi akademik menunjukkan 34 artikel dengan DOI yang berhasil diselesaikan dan akses terbuka legal, melampaui ambang 25 yang disyaratkan. Dampak yang mungkin timbul adalah penyalahgunaan indikator lama sebagai dasar pemblokiran permanen, sehingga setiap indikator diberi jendela waktu dan tingkat keyakinan. Tingkat keyakinan keseluruhan untuk pemetaan teknik adalah tinggi karena berasal dari basis pengetahuan yang dikurasi; tingkat keyakinan untuk atribusi aktor adalah sedang karena atribusi tidak diuji secara independen dalam laporan ini. Tindakan prioritas: integrasikan indikator ke sistem deteksi dengan masa berlaku terbatas, utamakan deteksi perilaku alih-alih hanya tanda statis, dan jadikan tabel pemetaan teknik sebagai dasar aturan deteksi berlapis (Hussain &amp; Petrova, 2026). Laporan ini juga memakai basis data indikator yang telah dinormalisasi dan menyertakan pemeriksaan otomatis atas setiap DOI, karena kualitas sumber menentukan bobot setiap klaim (Sajan, 2024; Raharjo &amp; Salman, 2023). Perbandingan perilaku antar pelaku disusun deskriptif tanpa peringkat subjektif, sejalan dengan praktik atribusi yang menuntut pemisahan antara bukti dan tafsir (Zhora et al., 2026; Irshad et al., 2026).</w:t>
+        <w:t>Laporan ini menyajikan analisis intelijen ancaman terhadap tiga kampanye malware: TA542 (Emotet), TA505 (Dridex), dan FIN6. Metode yang dipakai adalah intelijen ancaman pasif berbasis indikator: seluruh bukti berasal dari laporan yang telah dipublikasikan dan tidak ada sampel yang dijalankan. Tujuan kegiatan ini adalah mengumpulkan indikator kompromi, memetakan taktik dan teknik ke MITRE ATT&amp;CK, menganalisis infrastruktur command and control berdasarkan data pasif, menyusun model propagasi, dan membandingkan ketiga pelaku secara deskriptif. Kerangka kerja ini mengikuti siklus intelijen ancaman yang lazim digunakan dalam praktik CTI (Tolah, 2025; Abraham et al., 2025) dan memanfaatkan taksonomi ATT&amp;CK sebagai bahasa pemetaan bersama (Georgiadou et al., 2021). Temuan utama pertama, pengumpulan indikator menghasilkan 35 baris indikator ternormalisasi: 7 baris untuk TA542/Emotet dan 28 baris untuk TA505/Dridex, seluruhnya berasal dari publikasi resmi pemerintah dan telemetri sinkhole. Tidak satu pun indikator direkayasa; untuk FIN6 tidak terdapat indikator jaringan pada sumber yang dianalisis sehingga himpunannya dibiarkan kosong. Temuan kedua, pemetaan teknik menghasilkan 70 baris teknik terdokumentasi: 26 untuk TA542, 22 untuk TA505, dan 22 untuk FIN6, seluruhnya berkelas Documented dengan kalimat bukti yang dapat ditelusuri ke halaman MITRE ATT&amp;CK [MITRE-1][MITRE-2][MITRE-3][MITRE-4]. Temuan ketiga, ketiga pelaku berbeda secara struktural pada tahap command and control: TA542 memakai HTTP pada port non-standar dengan kanal terenkripsi, TA505 memakai botnet peer-to-peer dengan fast flux, dan FIN6 memakai terowongan SSH serta layanan web publik. Perbedaan ini penting karena strategi deteksi jaringan yang efektif untuk satu pelaku tidak otomatis berlaku untuk pelaku lain (Yamaguchi, 2022; Kim et al., 2022). Temuan keempat, kualitas bukti tidak seragam: seluruh baris teknik berkelas Documented, tetapi indikator jaringan hanya tersedia untuk dua dari tiga pelaku, dan laporan ini secara eksplisit menolak mengisi kekosongan tersebut. Temuan kelima, verifikasi referensi akademik menunjukkan 34 artikel dengan DOI yang berhasil diselesaikan dan akses terbuka legal, melampaui ambang 25 yang disyaratkan. Dampak yang mungkin timbul adalah penyalahgunaan indikator lama sebagai dasar pemblokiran permanen, sehingga setiap indikator diberi jendela waktu dan tingkat keyakinan. Tingkat keyakinan keseluruhan untuk pemetaan teknik adalah tinggi karena berasal dari basis pengetahuan yang dikurasi; tingkat keyakinan untuk atribusi aktor adalah sedang karena atribusi tidak diuji secara independen dalam laporan ini. Tindakan prioritas: integrasikan indikator ke sistem deteksi dengan masa berlaku terbatas, utamakan deteksi perilaku alih-alih hanya tanda statis, dan jadikan tabel pemetaan teknik sebagai dasar aturan deteksi berlapis (Hussain &amp; Petrova, 2026). Laporan ini juga memakai basis data indikator yang telah dinormalisasi dan menyertakan pemeriksaan otomatis atas setiap DOI, karena kualitas sumber menentukan bobot setiap klaim (Sajan, 2024; Raharjo &amp; Salman, 2023). Perbandingan perilaku antar pelaku disusun deskriptif tanpa peringkat subjektif, sejalan dengan praktik atribusi yang menuntut pemisahan antara bukti dan tafsir (Zhora et al., 2026; Irshad et al., 2026).</w:t>
       </w:r>
     </w:p>
     <w:p>
@@ -1737,7 +1737,7 @@
           <w:p>
             <w:r/>
             <w:r>
-              <w:t>36 baris indikator ternormalisasi tanpa duplikat</w:t>
+              <w:t>35 baris indikator ternormalisasi tanpa duplikat</w:t>
             </w:r>
           </w:p>
         </w:tc>
@@ -2216,7 +2216,7 @@
           <w:p>
             <w:r/>
             <w:r>
-              <w:t>Normalisasi menghasilkan 36 baris unik; tidak ada hash dengan panjang tidak sesuai</w:t>
+              <w:t>Normalisasi menghasilkan 35 baris unik; tidak ada hash dengan panjang tidak sesuai</w:t>
             </w:r>
           </w:p>
         </w:tc>
@@ -2493,7 +2493,7 @@
           <w:sz w:val="24"/>
           <w:szCs w:val="24"/>
         </w:rPr>
-        <w:t>Analisis Proyek 25 - Threat Intelligence Report (Malware Campaign). Tujuan spesifik: menghasilkan kumpulan indikator yang dapat diaudit, pemetaan teknik berkalimat bukti, analisis infrastruktur pasif, model propagasi per pelaku, dan perbandingan deskriptif. Pembagian peran pada kelompok: satu analis menangani pengumpulan dan normalisasi indikator, satu analis menangani pemetaan teknik dan analisis infrastruktur, satu penyusun menangani verifikasi referensi dan penulisan laporan. Metode: pengumpulan pasif, validasi, normalisasi, pemetaan taksonomi, dan verifikasi metadata pustaka. Luaran yang diminta soal adalah laporan bergaya perusahaan intelijen ancaman; luaran yang dihasilkan adalah laporan DOCX dan PDF, basis data indikator dalam bentuk CSV, berkas RIS dan BibTeX, arsip bukti, serta diagram alur kerja dan pemetaan. Hasil ringkas per komponen proyek: pengumpulan indikator menghasilkan 36 baris ternormalisasi dengan sumber yang tercatat; pemetaan teknik menghasilkan 70 baris teknik terdokumentasi; analisis infrastruktur menghasilkan karakterisasi kanal command and control untuk ketiga pelaku; analisis propagasi menghasilkan rantai serangan per pelaku dengan tahap yang tidak terdokumentasi ditandai eksplisit; analisis komparatif menghasilkan tabel perbandingan deskriptif tanpa peringkat. Hubungan antara indikator dan teknik dijelaskan pada bagian pemetaan: indikator statis mudah berubah, sedangkan teknik bertahan lebih lama, sehingga keduanya dipadukan sebagai deteksi berlapis (Akbar &amp; Khan, 2025; Kumar &amp; Subbiah, 2022). Verifikasi pustaka menjadi komponen tersendiri karena kualitas klaim intelijen bergantung pada kualitas sumber: 34 artikel diverifikasi DOI dan akses terbukanya, dengan 8 di antaranya berasal dari jurnal nasional terindeks dan sisanya dari penerbit internasional.Penggunaan taksonomi yang sama memungkinkan hasil pemetaan dipakai kembali oleh tim deteksi tanpa penerjemahan manual (Cichon et al., 2026). Untuk organisasi yang akan mengoperasionalkan hasil ini, integrasi indikator dan pemetaan teknik sebaiknya dijalankan melalui platform berbagi intelijen dengan kebijakan tata kelola yang jelas (Abeydeera, 2026).</w:t>
+        <w:t>Analisis Proyek 25 - Threat Intelligence Report (Malware Campaign). Tujuan spesifik: menghasilkan kumpulan indikator yang dapat diaudit, pemetaan teknik berkalimat bukti, analisis infrastruktur pasif, model propagasi per pelaku, dan perbandingan deskriptif. Pembagian peran pada kelompok: satu analis menangani pengumpulan dan normalisasi indikator, satu analis menangani pemetaan teknik dan analisis infrastruktur, satu penyusun menangani verifikasi referensi dan penulisan laporan. Metode: pengumpulan pasif, validasi, normalisasi, pemetaan taksonomi, dan verifikasi metadata pustaka. Luaran yang diminta soal adalah laporan bergaya perusahaan intelijen ancaman; luaran yang dihasilkan adalah laporan DOCX dan PDF, basis data indikator dalam bentuk CSV, berkas RIS dan BibTeX, arsip bukti, serta diagram alur kerja dan pemetaan. Hasil ringkas per komponen proyek: pengumpulan indikator menghasilkan 35 baris ternormalisasi dengan sumber yang tercatat; pemetaan teknik menghasilkan 70 baris teknik terdokumentasi; analisis infrastruktur menghasilkan karakterisasi kanal command and control untuk ketiga pelaku; analisis propagasi menghasilkan rantai serangan per pelaku dengan tahap yang tidak terdokumentasi ditandai eksplisit; analisis komparatif menghasilkan tabel perbandingan deskriptif tanpa peringkat. Hubungan antara indikator dan teknik dijelaskan pada bagian pemetaan: indikator statis mudah berubah, sedangkan teknik bertahan lebih lama, sehingga keduanya dipadukan sebagai deteksi berlapis (Akbar &amp; Khan, 2025; Kumar &amp; Subbiah, 2022). Verifikasi pustaka menjadi komponen tersendiri karena kualitas klaim intelijen bergantung pada kualitas sumber: 34 artikel diverifikasi DOI dan akses terbukanya, dengan 8 di antaranya berasal dari jurnal nasional terindeks dan sisanya dari penerbit internasional.Penggunaan taksonomi yang sama memungkinkan hasil pemetaan dipakai kembali oleh tim deteksi tanpa penerjemahan manual (Cichon et al., 2026). Untuk organisasi yang akan mengoperasionalkan hasil ini, integrasi indikator dan pemetaan teknik sebaiknya dijalankan melalui platform berbagi intelijen dengan kebijakan tata kelola yang jelas (Abeydeera, 2026).</w:t>
       </w:r>
     </w:p>
     <w:tbl>
@@ -2612,7 +2612,7 @@
           <w:p>
             <w:r/>
             <w:r>
-              <w:t>36 baris indikator ternormalisasi; 7 untuk TA542/Emotet dan 29 untuk TA505/Dridex; FIN6 tidak memiliki indikator jaringan pada sumber yang dianalisis</w:t>
+              <w:t>35 baris indikator ternormalisasi; 7 untuk TA542/Emotet dan 29 untuk TA505/Dridex; FIN6 tidak memiliki indikator jaringan pada sumber yang dianalisis</w:t>
             </w:r>
           </w:p>
         </w:tc>
@@ -3534,7 +3534,7 @@
           <w:sz w:val="24"/>
           <w:szCs w:val="24"/>
         </w:rPr>
-        <w:t>Lampiran memuat berkas yang benar-benar dihasilkan. Berkas indikator: ioc/ta542_emotet_ioc.csv, ioc/ta505_dridex_ioc.csv, ioc/fin6_ioc.csv (kosong dengan sengaja, lihat bagian batasan), dan ioc/all_ioc_normalized.csv. Berkas pemetaan: ttp_mapping.json dan salinannya di evidence/mitre. Berkas pustaka: references.ris, references.bib, refs_final.json, dan reference_validation.md. Arsip bukti: evidence/vendor_reports (advisory CISA beserta berkas CSV dan STIX, serta cuplikan pelacak Feodo), evidence/mitre, evidence/academic, evidence/otx, dan evidence/malwarebazaar. Diagram: figures/ berisi berkas HTML interaktif hasil Archify beserta bukti pemeriksaan otomatis. Berkas soal asli dan template asli dosen dipertahankan tanpa perubahan struktur, ukuran kertas, margin, gaya, atau penomoran.</w:t>
+        <w:t>Lampiran memuat berkas yang benar-benar dihasilkan. Berkas indikator: ioc/ta542_emotet_ioc.csv, ioc/ta505_dridex_ioc.csv, dan ioc/all_ioc_normalized.csv. Berkas fin6_ioc.csv tidak dibuat karena tidak ada indikator jaringan FIN6 pada sumber yang dianalisis, dan berkas kosong berisiko disalahartikan sebagai data terkumpul. Berkas pemetaan: ttp_mapping.json dan salinannya di evidence/mitre. Berkas pustaka: references.ris, references.bib, refs_final.json, dan reference_validation.md. Arsip bukti: evidence/vendor_reports (advisory CISA beserta berkas CSV dan STIX, serta cuplikan pelacak Feodo), evidence/mitre, evidence/academic, evidence/otx, dan evidence/malwarebazaar. Diagram: figures/ berisi berkas HTML interaktif hasil Archify beserta bukti pemeriksaan otomatis. Berkas soal asli dan template asli dosen dipertahankan tanpa perubahan struktur, ukuran kertas, margin, gaya, atau penomoran.</w:t>
       </w:r>
     </w:p>
     <w:p>
@@ -3800,7 +3800,7 @@
           <w:p>
             <w:r/>
             <w:r>
-              <w:t>ioc/fin6_ioc.csv</w:t>
+              <w:t>tidak ada berkas (lihat catatan)</w:t>
             </w:r>
           </w:p>
         </w:tc>
@@ -3868,7 +3868,7 @@
           <w:p>
             <w:r/>
             <w:r>
-              <w:t>36</w:t>
+              <w:t>35</w:t>
             </w:r>
           </w:p>
         </w:tc>

</xml_diff>

<commit_message>
Add the attack-chain diagram and pass the full QC gate
The attack-chain preset is authored as three single-row actor lanes with no wrap
edges, which is the shape the Archify validator accepts at showcase quality. All
eight diagrams now pass validate/deliver/check/browser-check, and the report carries
seven figures with sequential captions.

qc_final.py is the gate: template preservation, placeholder scan, citation/reference
cross-check, DOI and open-access assertions, IOC and TTP presence, figure captions,
diagram receipts, payload scan, and PDF integrity. All green.
</commit_message>
<xml_diff>
--- a/MATEL_Threat_Intelligence_Report.docx
+++ b/MATEL_Threat_Intelligence_Report.docx
@@ -4247,6 +4247,52 @@
         <w:t>FIN6 menggunakan perkakas yang sah untuk membangun terowongan dan menyimpan muatan pada layanan publik, sehingga lalu lintasnya menyerupai administrasi normal. Pola ini paling sulit dideteksi dengan daftar hitam, karena alamat yang digunakan sering merupakan layanan yang sah dan diperlukan organisasi. Penanganannya menuntut anomali perilaku akun dan waktu akses, bukan pemadanan daftar hitam semata (Alodat, 2023).</w:t>
       </w:r>
     </w:p>
+    <w:p>
+      <w:r>
+        <w:drawing>
+          <wp:inline xmlns:a="http://schemas.openxmlformats.org/drawingml/2006/main" xmlns:pic="http://schemas.openxmlformats.org/drawingml/2006/picture">
+            <wp:extent cx="5461000" cy="1603022"/>
+            <wp:docPr id="1736493129" name="Picture 1736493129"/>
+            <wp:cNvGraphicFramePr>
+              <a:graphicFrameLocks noChangeAspect="1"/>
+            </wp:cNvGraphicFramePr>
+            <a:graphic>
+              <a:graphicData uri="http://schemas.openxmlformats.org/drawingml/2006/picture">
+                <pic:pic>
+                  <pic:nvPicPr>
+                    <pic:cNvPr id="0" name="attack-chain.png"/>
+                    <pic:cNvPicPr/>
+                  </pic:nvPicPr>
+                  <pic:blipFill>
+                    <a:blip r:embed="rId13"/>
+                    <a:stretch>
+                      <a:fillRect/>
+                    </a:stretch>
+                  </pic:blipFill>
+                  <pic:spPr>
+                    <a:xfrm>
+                      <a:off x="0" y="0"/>
+                      <a:ext cx="5461000" cy="1603022"/>
+                    </a:xfrm>
+                    <a:prstGeom prst="rect"/>
+                  </pic:spPr>
+                </pic:pic>
+              </a:graphicData>
+            </a:graphic>
+          </wp:inline>
+        </w:drawing>
+      </w:r>
+    </w:p>
+    <w:p>
+      <w:pPr/>
+      <w:r>
+        <w:rPr>
+          <w:i/>
+          <w:sz w:val="18"/>
+        </w:rPr>
+        <w:t>Gambar 2. Rantai serangan per pelaku; hanya tahap yang terdokumentasi yang digambar.</w:t>
+      </w:r>
+    </w:p>
     <w:tbl>
       <w:tblPr>
         <w:tblStyle w:val="TableGrid"/>
@@ -4491,7 +4537,7 @@
         <w:drawing>
           <wp:inline xmlns:a="http://schemas.openxmlformats.org/drawingml/2006/main" xmlns:pic="http://schemas.openxmlformats.org/drawingml/2006/picture">
             <wp:extent cx="5461000" cy="1603022"/>
-            <wp:docPr id="1736493129" name="Picture 1736493129"/>
+            <wp:docPr id="1736493130" name="Picture 1736493130"/>
             <wp:cNvGraphicFramePr>
               <a:graphicFrameLocks noChangeAspect="1"/>
             </wp:cNvGraphicFramePr>
@@ -4503,7 +4549,7 @@
                     <pic:cNvPicPr/>
                   </pic:nvPicPr>
                   <pic:blipFill>
-                    <a:blip r:embed="rId13"/>
+                    <a:blip r:embed="rId14"/>
                     <a:stretch>
                       <a:fillRect/>
                     </a:stretch>
@@ -4529,7 +4575,7 @@
           <w:i/>
           <w:sz w:val="18"/>
         </w:rPr>
-        <w:t>Gambar 2. Model propagasi per pelaku dengan penandaan tahap yang tidak terdokumentasi.</w:t>
+        <w:t>Gambar 3. Model propagasi per pelaku dengan penandaan tahap yang tidak terdokumentasi.</w:t>
       </w:r>
     </w:p>
     <w:p>
@@ -5106,7 +5152,7 @@
         <w:drawing>
           <wp:inline xmlns:a="http://schemas.openxmlformats.org/drawingml/2006/main" xmlns:pic="http://schemas.openxmlformats.org/drawingml/2006/picture">
             <wp:extent cx="5461000" cy="1603022"/>
-            <wp:docPr id="1736493130" name="Picture 1736493130"/>
+            <wp:docPr id="1736493131" name="Picture 1736493131"/>
             <wp:cNvGraphicFramePr>
               <a:graphicFrameLocks noChangeAspect="1"/>
             </wp:cNvGraphicFramePr>
@@ -5118,7 +5164,7 @@
                     <pic:cNvPicPr/>
                   </pic:nvPicPr>
                   <pic:blipFill>
-                    <a:blip r:embed="rId14"/>
+                    <a:blip r:embed="rId15"/>
                     <a:stretch>
                       <a:fillRect/>
                     </a:stretch>
@@ -5144,7 +5190,7 @@
           <w:i/>
           <w:sz w:val="18"/>
         </w:rPr>
-        <w:t>Gambar 3. Linimasa kampanye berdasarkan tanggal yang tercatat pada sumber.</w:t>
+        <w:t>Gambar 4. Linimasa kampanye berdasarkan tanggal yang tercatat pada sumber.</w:t>
       </w:r>
     </w:p>
     <w:p>
@@ -5178,7 +5224,7 @@
         <w:drawing>
           <wp:inline xmlns:a="http://schemas.openxmlformats.org/drawingml/2006/main" xmlns:pic="http://schemas.openxmlformats.org/drawingml/2006/picture">
             <wp:extent cx="5461000" cy="1603022"/>
-            <wp:docPr id="1736493131" name="Picture 1736493131"/>
+            <wp:docPr id="1736493132" name="Picture 1736493132"/>
             <wp:cNvGraphicFramePr>
               <a:graphicFrameLocks noChangeAspect="1"/>
             </wp:cNvGraphicFramePr>
@@ -5187,52 +5233,6 @@
                 <pic:pic>
                   <pic:nvPicPr>
                     <pic:cNvPr id="0" name="ttp-coverage.png"/>
-                    <pic:cNvPicPr/>
-                  </pic:nvPicPr>
-                  <pic:blipFill>
-                    <a:blip r:embed="rId15"/>
-                    <a:stretch>
-                      <a:fillRect/>
-                    </a:stretch>
-                  </pic:blipFill>
-                  <pic:spPr>
-                    <a:xfrm>
-                      <a:off x="0" y="0"/>
-                      <a:ext cx="5461000" cy="1603022"/>
-                    </a:xfrm>
-                    <a:prstGeom prst="rect"/>
-                  </pic:spPr>
-                </pic:pic>
-              </a:graphicData>
-            </a:graphic>
-          </wp:inline>
-        </w:drawing>
-      </w:r>
-    </w:p>
-    <w:p>
-      <w:pPr/>
-      <w:r>
-        <w:rPr>
-          <w:i/>
-          <w:sz w:val="18"/>
-        </w:rPr>
-        <w:t>Gambar 4. Cakupan taktik ATT&amp;CK per pelaku beserta jumlah teknik terdokumentasi (0 berarti tidak terdokumentasi pada sumber).</w:t>
-      </w:r>
-    </w:p>
-    <w:p>
-      <w:r>
-        <w:drawing>
-          <wp:inline xmlns:a="http://schemas.openxmlformats.org/drawingml/2006/main" xmlns:pic="http://schemas.openxmlformats.org/drawingml/2006/picture">
-            <wp:extent cx="5461000" cy="1603022"/>
-            <wp:docPr id="1736493132" name="Picture 1736493132"/>
-            <wp:cNvGraphicFramePr>
-              <a:graphicFrameLocks noChangeAspect="1"/>
-            </wp:cNvGraphicFramePr>
-            <a:graphic>
-              <a:graphicData uri="http://schemas.openxmlformats.org/drawingml/2006/picture">
-                <pic:pic>
-                  <pic:nvPicPr>
-                    <pic:cNvPr id="0" name="actor-relationship.png"/>
                     <pic:cNvPicPr/>
                   </pic:nvPicPr>
                   <pic:blipFill>
@@ -5262,7 +5262,7 @@
           <w:i/>
           <w:sz w:val="18"/>
         </w:rPr>
-        <w:t>Gambar 5. Hubungan pelaku, keluarga malware, dan himpunan indikator berdasarkan sumber yang dianalisis.</w:t>
+        <w:t>Gambar 5. Cakupan taktik ATT&amp;CK per pelaku beserta jumlah teknik terdokumentasi (0 berarti tidak terdokumentasi pada sumber).</w:t>
       </w:r>
     </w:p>
     <w:p>
@@ -5278,7 +5278,7 @@
               <a:graphicData uri="http://schemas.openxmlformats.org/drawingml/2006/picture">
                 <pic:pic>
                   <pic:nvPicPr>
-                    <pic:cNvPr id="0" name="workflow-methodology.png"/>
+                    <pic:cNvPr id="0" name="actor-relationship.png"/>
                     <pic:cNvPicPr/>
                   </pic:nvPicPr>
                   <pic:blipFill>
@@ -5308,7 +5308,53 @@
           <w:i/>
           <w:sz w:val="18"/>
         </w:rPr>
-        <w:t>Gambar 6. Alur kerja intelijen ancaman pasif yang dijalankan pada MATEL.</w:t>
+        <w:t>Gambar 6. Hubungan pelaku, keluarga malware, dan himpunan indikator berdasarkan sumber yang dianalisis.</w:t>
+      </w:r>
+    </w:p>
+    <w:p>
+      <w:r>
+        <w:drawing>
+          <wp:inline xmlns:a="http://schemas.openxmlformats.org/drawingml/2006/main" xmlns:pic="http://schemas.openxmlformats.org/drawingml/2006/picture">
+            <wp:extent cx="5461000" cy="1603022"/>
+            <wp:docPr id="1736493134" name="Picture 1736493134"/>
+            <wp:cNvGraphicFramePr>
+              <a:graphicFrameLocks noChangeAspect="1"/>
+            </wp:cNvGraphicFramePr>
+            <a:graphic>
+              <a:graphicData uri="http://schemas.openxmlformats.org/drawingml/2006/picture">
+                <pic:pic>
+                  <pic:nvPicPr>
+                    <pic:cNvPr id="0" name="workflow-methodology.png"/>
+                    <pic:cNvPicPr/>
+                  </pic:nvPicPr>
+                  <pic:blipFill>
+                    <a:blip r:embed="rId18"/>
+                    <a:stretch>
+                      <a:fillRect/>
+                    </a:stretch>
+                  </pic:blipFill>
+                  <pic:spPr>
+                    <a:xfrm>
+                      <a:off x="0" y="0"/>
+                      <a:ext cx="5461000" cy="1603022"/>
+                    </a:xfrm>
+                    <a:prstGeom prst="rect"/>
+                  </pic:spPr>
+                </pic:pic>
+              </a:graphicData>
+            </a:graphic>
+          </wp:inline>
+        </w:drawing>
+      </w:r>
+    </w:p>
+    <w:p>
+      <w:pPr/>
+      <w:r>
+        <w:rPr>
+          <w:i/>
+          <w:sz w:val="18"/>
+        </w:rPr>
+        <w:t>Gambar 7. Alur kerja intelijen ancaman pasif yang dijalankan pada MATEL.</w:t>
       </w:r>
     </w:p>
     <w:p>

</xml_diff>